<commit_message>
Document project impact and value in the Congolese context
- IMPACT.md: standalone impact brief (why it matters in DRC, value vs GFW/RADD,
  concrete beneficiaries, REDD+/Mai-Ndombe carbon finance, honest limits)
- memoir: new Chapter 5 'Impact et plus-value dans le contexte congolais'
- soutenance deck: 2 new slides (value in DRC context + impact by stakeholder)
- README links IMPACT.md; memoir/slides regenerated

Co-Authored-By: Claude Opus 4.8 <noreply@anthropic.com>
Claude-Session: https://claude.ai/code/session_012VEQmNdfkHMt6fhJx4FZvT
</commit_message>
<xml_diff>
--- a/docs/memoire_deforestwatch.docx
+++ b/docs/memoire_deforestwatch.docx
@@ -2454,6 +2454,163 @@
           <w:color w:val="0B6E2D"/>
           <w:sz w:val="32"/>
         </w:rPr>
+        <w:t>Chapitre 5 — Impact et plus-value dans le contexte congolais</w:t>
+      </w:r>
+    </w:p>
+    <w:p>
+      <w:r>
+        <w:rPr>
+          <w:b/>
+          <w:color w:val="0B6E2D"/>
+          <w:sz w:val="26"/>
+        </w:rPr>
+        <w:t>5.1. Un enjeu national et mondial</w:t>
+      </w:r>
+    </w:p>
+    <w:p>
+      <w:pPr>
+        <w:jc w:val="both"/>
+      </w:pPr>
+      <w:r>
+        <w:rPr>
+          <w:sz w:val="22"/>
+        </w:rPr>
+        <w:t>La RDC abrite environ 60 % de la forêt du Bassin du Congo, deuxième poumon vert de la planète, et la Cuvette centrale y stocke d'immenses quantités de carbone. Le pays figure parmi les premiers au monde pour la perte de forêt primaire. La déforestation y est surtout diffuse (agriculture sur brûlis, charbon de bois, exploitation artisanale), donc mal captée par les outils globaux : une approche locale et fine est requise.</w:t>
+      </w:r>
+    </w:p>
+    <w:p>
+      <w:r>
+        <w:rPr>
+          <w:b/>
+          <w:color w:val="0B6E2D"/>
+          <w:sz w:val="26"/>
+        </w:rPr>
+        <w:t>5.2. Une province au cœur de la finance climat</w:t>
+      </w:r>
+    </w:p>
+    <w:p>
+      <w:pPr>
+        <w:jc w:val="both"/>
+      </w:pPr>
+      <w:r>
+        <w:rPr>
+          <w:sz w:val="22"/>
+        </w:rPr>
+        <w:t>Le Mai-Ndombe est une province pilote REDD+ : réduire et prouver la déforestation y a une valeur financière directe (paiements aux résultats). Le module d'estimation des émissions de CO₂ relie ainsi les résultats techniques au langage des bailleurs (MRV, crédits carbone).</w:t>
+      </w:r>
+    </w:p>
+    <w:p>
+      <w:r>
+        <w:rPr>
+          <w:b/>
+          <w:color w:val="0B6E2D"/>
+          <w:sz w:val="26"/>
+        </w:rPr>
+        <w:t>5.3. D'un outil de constat à un outil d'action</w:t>
+      </w:r>
+    </w:p>
+    <w:p>
+      <w:pPr>
+        <w:jc w:val="both"/>
+      </w:pPr>
+      <w:r>
+        <w:rPr>
+          <w:sz w:val="22"/>
+        </w:rPr>
+        <w:t>Comparés aux plateformes existantes (Global Forest Watch, RADD), DeforestWatch-DRC apporte : une adaptation au contexte local, une dimension prédictive (carte de risque), une interface en français, la remontée d'information citoyenne (signalement) et la traduction de la perte forestière en impact carbone.</w:t>
+      </w:r>
+    </w:p>
+    <w:p>
+      <w:r>
+        <w:rPr>
+          <w:b/>
+          <w:color w:val="0B6E2D"/>
+          <w:sz w:val="26"/>
+        </w:rPr>
+        <w:t>5.4. Bénéficiaires concrets</w:t>
+      </w:r>
+    </w:p>
+    <w:p>
+      <w:pPr>
+        <w:pStyle w:val="ListBullet"/>
+      </w:pPr>
+      <w:r>
+        <w:t>Ministère de l'Environnement / DIAF : brique d'un système national de surveillance (MRV), au service de la souveraineté des données.</w:t>
+      </w:r>
+    </w:p>
+    <w:p>
+      <w:pPr>
+        <w:pStyle w:val="ListBullet"/>
+      </w:pPr>
+      <w:r>
+        <w:t>Gardes forestiers / ICCN : alertes géolocalisées pour intervenir vite ; radar Sentinel-1 pour surveiller même sous les nuages.</w:t>
+      </w:r>
+    </w:p>
+    <w:p>
+      <w:pPr>
+        <w:pStyle w:val="ListBullet"/>
+      </w:pPr>
+      <w:r>
+        <w:t>Gouvernement provincial du Mai-Ndombe : ciblage des secteurs prioritaires.</w:t>
+      </w:r>
+    </w:p>
+    <w:p>
+      <w:pPr>
+        <w:pStyle w:val="ListBullet"/>
+      </w:pPr>
+      <w:r>
+        <w:t>Communautés locales : signalement participatif, protection de la ressource.</w:t>
+      </w:r>
+    </w:p>
+    <w:p>
+      <w:pPr>
+        <w:pStyle w:val="ListBullet"/>
+      </w:pPr>
+      <w:r>
+        <w:t>ONG et porteurs de projets carbone : quantification pour les crédits.</w:t>
+      </w:r>
+    </w:p>
+    <w:p>
+      <w:pPr>
+        <w:pStyle w:val="ListBullet"/>
+      </w:pPr>
+      <w:r>
+        <w:t>Bailleurs (CAFI, Banque mondiale) : transparence conditionnant les paiements.</w:t>
+      </w:r>
+    </w:p>
+    <w:p>
+      <w:r>
+        <w:rPr>
+          <w:b/>
+          <w:color w:val="0B6E2D"/>
+          <w:sz w:val="26"/>
+        </w:rPr>
+        <w:t>5.5. Limites et positionnement</w:t>
+      </w:r>
+    </w:p>
+    <w:p>
+      <w:pPr>
+        <w:jc w:val="both"/>
+      </w:pPr>
+      <w:r>
+        <w:rPr>
+          <w:sz w:val="22"/>
+        </w:rPr>
+        <w:t>Le projet est une preuve de concept : ses résultats doivent être validés sur images réelles et données de terrain. Il complète — sans le remplacer — un système national, et vaut aussi comme renforcement de capacités : démontrer qu'un tel outil peut être conçu et maîtrisé localement.</w:t>
+      </w:r>
+    </w:p>
+    <w:p>
+      <w:r>
+        <w:br w:type="page"/>
+      </w:r>
+    </w:p>
+    <w:p>
+      <w:r>
+        <w:rPr>
+          <w:b/>
+          <w:color w:val="0B6E2D"/>
+          <w:sz w:val="32"/>
+        </w:rPr>
         <w:t>Conclusion générale et perspectives</w:t>
       </w:r>
     </w:p>

</xml_diff>